<commit_message>
added starter templates plus interview tweaks
</commit_message>
<xml_diff>
--- a/docassemble/ParentingTimeSchedule/data/templates/Motion_to_modify_parenting_time.docx
+++ b/docassemble/ParentingTimeSchedule/data/templates/Motion_to_modify_parenting_time.docx
@@ -565,7 +565,7 @@
           <w:bCs/>
           <w:u w:val="single"/>
         </w:rPr>
-        <w:t xml:space="preserve"> upper</w:t>
+        <w:t xml:space="preserve"> </w:t>
       </w:r>
       <w:r>
         <w:rPr>
@@ -574,7 +574,7 @@
           <w:bCs/>
           <w:u w:val="single"/>
         </w:rPr>
-        <w:t>}</w:t>
+        <w:t>.</w:t>
       </w:r>
       <w:r>
         <w:rPr>
@@ -583,7 +583,7 @@
           <w:bCs/>
           <w:u w:val="single"/>
         </w:rPr>
-        <w:t xml:space="preserve"> </w:t>
+        <w:t>upper</w:t>
       </w:r>
       <w:r>
         <w:rPr>
@@ -592,7 +592,25 @@
           <w:bCs/>
           <w:u w:val="single"/>
         </w:rPr>
-        <w:t>PARENTING TIME SCHEDULE</w:t>
+        <w:t>}</w:t>
+      </w:r>
+      <w:r>
+        <w:rPr>
+          <w:rFonts w:ascii="Arial" w:hAnsi="Arial" w:cs="Arial"/>
+          <w:b/>
+          <w:bCs/>
+          <w:u w:val="single"/>
+        </w:rPr>
+        <w:t xml:space="preserve"> </w:t>
+      </w:r>
+      <w:r>
+        <w:rPr>
+          <w:rFonts w:ascii="Arial" w:hAnsi="Arial" w:cs="Arial"/>
+          <w:b/>
+          <w:bCs/>
+          <w:u w:val="single"/>
+        </w:rPr>
+        <w:t>PARENTING TIME</w:t>
       </w:r>
     </w:p>
     <w:p>
@@ -717,9 +735,6 @@
         <w:t xml:space="preserve"> I am {age_in_years} years old. {“</w:t>
       </w:r>
       <w:r>
-        <w:t xml:space="preserve"> </w:t>
-      </w:r>
-      <w:r>
         <w:rPr>
           <w:rFonts w:ascii="Arial" w:hAnsi="Arial" w:cs="Arial"/>
         </w:rPr>
@@ -748,55 +763,7 @@
         <w:rPr>
           <w:rFonts w:ascii="Arial" w:hAnsi="Arial" w:cs="Arial"/>
         </w:rPr>
-        <w:t xml:space="preserve">The other parent is </w:t>
-      </w:r>
-      <w:r>
-        <w:rPr>
-          <w:rFonts w:ascii="Arial" w:hAnsi="Arial" w:cs="Arial"/>
-        </w:rPr>
-        <w:t>{</w:t>
-      </w:r>
-      <w:r>
-        <w:rPr>
-          <w:rFonts w:ascii="Arial" w:hAnsi="Arial" w:cs="Arial"/>
-        </w:rPr>
-        <w:t>other_parties[0]</w:t>
-      </w:r>
-      <w:r>
-        <w:rPr>
-          <w:rFonts w:ascii="Arial" w:hAnsi="Arial" w:cs="Arial"/>
-        </w:rPr>
-        <w:t xml:space="preserve">}. </w:t>
-      </w:r>
-      <w:r>
-        <w:rPr>
-          <w:rFonts w:ascii="Arial" w:hAnsi="Arial" w:cs="Arial"/>
-        </w:rPr>
-        <w:t>They are</w:t>
-      </w:r>
-      <w:r>
-        <w:rPr>
-          <w:rFonts w:ascii="Arial" w:hAnsi="Arial" w:cs="Arial"/>
-        </w:rPr>
-        <w:t xml:space="preserve"> {age_in_years} years old. </w:t>
-      </w:r>
-      <w:r>
-        <w:rPr>
-          <w:rFonts w:ascii="Arial" w:hAnsi="Arial" w:cs="Arial"/>
-        </w:rPr>
-        <w:t>They live at {other_pareties[0]</w:t>
-      </w:r>
-      <w:r>
-        <w:rPr>
-          <w:rFonts w:ascii="Arial" w:hAnsi="Arial" w:cs="Arial"/>
-        </w:rPr>
-        <w:t xml:space="preserve"> address]}</w:t>
-      </w:r>
-      <w:r>
-        <w:rPr>
-          <w:rFonts w:ascii="Arial" w:hAnsi="Arial" w:cs="Arial"/>
-        </w:rPr>
-        <w:t>.</w:t>
+        <w:t>The other parent is {other_parties[0]}. They are {age_in_years} years old. They live at {other_pareties[0] address]}.</w:t>
       </w:r>
     </w:p>
     <w:p>
@@ -914,7 +881,7 @@
         <w:rPr>
           <w:rFonts w:ascii="Arial" w:hAnsi="Arial" w:cs="Arial"/>
         </w:rPr>
-        <w:t xml:space="preserve">{if specific} {other_parties} and I have not been able to agree on consistent days and times for parenting time. {if modify} </w:t>
+        <w:t xml:space="preserve">{if specific}{other_parties} and I have not been able to agree on consistent days and times for parenting time. {if modify} </w:t>
       </w:r>
       <w:r>
         <w:rPr>
@@ -939,6 +906,12 @@
           <w:rFonts w:ascii="Arial" w:hAnsi="Arial" w:cs="Arial"/>
         </w:rPr>
         <w:t xml:space="preserve"> {changed_circumstances}</w:t>
+      </w:r>
+      <w:r>
+        <w:rPr>
+          <w:rFonts w:ascii="Arial" w:hAnsi="Arial" w:cs="Arial"/>
+        </w:rPr>
+        <w:t>{endif}</w:t>
       </w:r>
     </w:p>
     <w:p>
@@ -1034,31 +1007,20 @@
         <w:rPr>
           <w:rFonts w:ascii="Arial" w:hAnsi="Arial" w:cs="Arial"/>
         </w:rPr>
-        <w:t>{if specific}</w:t>
-      </w:r>
-      <w:r>
-        <w:rPr>
-          <w:rFonts w:ascii="Arial" w:hAnsi="Arial" w:cs="Arial"/>
-        </w:rPr>
-        <w:t xml:space="preserve">That the Court enter and order granting me a specific parenting time schedule with </w:t>
-      </w:r>
-      <w:r>
-        <w:rPr>
-          <w:rFonts w:ascii="Arial" w:hAnsi="Arial" w:cs="Arial"/>
-        </w:rPr>
-        <w:t xml:space="preserve">the </w:t>
-      </w:r>
-      <w:r>
-        <w:rPr>
-          <w:rFonts w:ascii="Arial" w:hAnsi="Arial" w:cs="Arial"/>
-        </w:rPr>
-        <w:t>{child or children} as described below:</w:t>
-      </w:r>
-      <w:r>
-        <w:rPr>
-          <w:rFonts w:ascii="Arial" w:hAnsi="Arial" w:cs="Arial"/>
-        </w:rPr>
-        <w:t xml:space="preserve"> {if modify}</w:t>
+        <w:lastRenderedPageBreak/>
+        <w:t>{if specific}That the Court enter and order granting me a specific parenting time schedule with the {child or children} as described below:</w:t>
+      </w:r>
+      <w:r>
+        <w:rPr>
+          <w:rFonts w:ascii="Arial" w:hAnsi="Arial" w:cs="Arial"/>
+        </w:rPr>
+        <w:t>{endif}</w:t>
+      </w:r>
+      <w:r>
+        <w:rPr>
+          <w:rFonts w:ascii="Arial" w:hAnsi="Arial" w:cs="Arial"/>
+        </w:rPr>
+        <w:t>{if modify}</w:t>
       </w:r>
       <w:r>
         <w:t>T</w:t>
@@ -1067,14 +1029,13 @@
         <w:rPr>
           <w:rFonts w:ascii="Arial" w:hAnsi="Arial" w:cs="Arial"/>
         </w:rPr>
-        <w:t xml:space="preserve">hat the Court </w:t>
-      </w:r>
-      <w:r>
-        <w:rPr>
-          <w:rFonts w:ascii="Arial" w:hAnsi="Arial" w:cs="Arial"/>
-        </w:rPr>
-        <w:lastRenderedPageBreak/>
-        <w:t>modify the existing parenting time to this schedule below which reflects the changed circumstances:</w:t>
+        <w:t>hat the Court modify the existing parenting time to this schedule below which reflects the changed circumstances:</w:t>
+      </w:r>
+      <w:r>
+        <w:rPr>
+          <w:rFonts w:ascii="Arial" w:hAnsi="Arial" w:cs="Arial"/>
+        </w:rPr>
+        <w:t>{endif}</w:t>
       </w:r>
     </w:p>
     <w:p>
@@ -1093,17 +1054,16 @@
         <w:rPr>
           <w:rFonts w:ascii="Arial" w:hAnsi="Arial" w:cs="Arial"/>
         </w:rPr>
-        <w:t>{if weekly_schedule}</w:t>
-      </w:r>
-      <w:r>
-        <w:rPr>
-          <w:rFonts w:ascii="Arial" w:hAnsi="Arial" w:cs="Arial"/>
-        </w:rPr>
-        <w:t>WEEKLY PARENTING TIME SCHEDULE</w:t>
+        <w:t>This parenting time schedule will begin on {schedule_start_date or “as soon as this schedule is ordered by the Court.”}</w:t>
       </w:r>
     </w:p>
     <w:p>
       <w:pPr>
+        <w:pStyle w:val="ListParagraph"/>
+        <w:numPr>
+          <w:ilvl w:val="0"/>
+          <w:numId w:val="3"/>
+        </w:numPr>
         <w:spacing w:after="0"/>
         <w:rPr>
           <w:rFonts w:ascii="Arial" w:hAnsi="Arial" w:cs="Arial"/>
@@ -1113,19 +1073,13 @@
         <w:rPr>
           <w:rFonts w:ascii="Arial" w:hAnsi="Arial" w:cs="Arial"/>
         </w:rPr>
-        <w:t>The schedule below has each day separated into one-hour blocks, except for overnights, which begin at</w:t>
-      </w:r>
-      <w:r>
-        <w:rPr>
-          <w:rFonts w:ascii="Arial" w:hAnsi="Arial" w:cs="Arial"/>
-        </w:rPr>
-        <w:t xml:space="preserve"> </w:t>
-      </w:r>
-      <w:r>
-        <w:rPr>
-          <w:rFonts w:ascii="Arial" w:hAnsi="Arial" w:cs="Arial"/>
-        </w:rPr>
-        <w:t>9:00 PM and end at 8:00 AM the next day.</w:t>
+        <w:t>{if weekly_schedule}</w:t>
+      </w:r>
+      <w:r>
+        <w:rPr>
+          <w:rFonts w:ascii="Arial" w:hAnsi="Arial" w:cs="Arial"/>
+        </w:rPr>
+        <w:t>WEEKLY PARENTING TIME SCHEDULE</w:t>
       </w:r>
     </w:p>
     <w:p>
@@ -1139,25 +1093,19 @@
         <w:rPr>
           <w:rFonts w:ascii="Arial" w:hAnsi="Arial" w:cs="Arial"/>
         </w:rPr>
-        <w:t xml:space="preserve">Parent Name: </w:t>
-      </w:r>
-      <w:r>
-        <w:rPr>
-          <w:rFonts w:ascii="Arial" w:hAnsi="Arial" w:cs="Arial"/>
-        </w:rPr>
-        <w:t xml:space="preserve">{user}, </w:t>
-      </w:r>
-      <w:r>
-        <w:rPr>
-          <w:rFonts w:ascii="Arial" w:hAnsi="Arial" w:cs="Arial"/>
-        </w:rPr>
-        <w:t>Initials:</w:t>
-      </w:r>
-      <w:r>
-        <w:rPr>
-          <w:rFonts w:ascii="Arial" w:hAnsi="Arial" w:cs="Arial"/>
-        </w:rPr>
-        <w:t xml:space="preserve"> {user initials}</w:t>
+        <w:t>The schedule below has each day separated into one-hour blocks, except for overnights, which begin at</w:t>
+      </w:r>
+      <w:r>
+        <w:rPr>
+          <w:rFonts w:ascii="Arial" w:hAnsi="Arial" w:cs="Arial"/>
+        </w:rPr>
+        <w:t xml:space="preserve"> </w:t>
+      </w:r>
+      <w:r>
+        <w:rPr>
+          <w:rFonts w:ascii="Arial" w:hAnsi="Arial" w:cs="Arial"/>
+        </w:rPr>
+        <w:t>9:00 PM and end at 8:00 AM the next day.</w:t>
       </w:r>
     </w:p>
     <w:p>
@@ -1177,19 +1125,7 @@
         <w:rPr>
           <w:rFonts w:ascii="Arial" w:hAnsi="Arial" w:cs="Arial"/>
         </w:rPr>
-        <w:t>{</w:t>
-      </w:r>
-      <w:r>
-        <w:rPr>
-          <w:rFonts w:ascii="Arial" w:hAnsi="Arial" w:cs="Arial"/>
-        </w:rPr>
-        <w:t>other_parties[0]</w:t>
-      </w:r>
-      <w:r>
-        <w:rPr>
-          <w:rFonts w:ascii="Arial" w:hAnsi="Arial" w:cs="Arial"/>
-        </w:rPr>
-        <w:t xml:space="preserve">}, </w:t>
+        <w:t xml:space="preserve">{user}, </w:t>
       </w:r>
       <w:r>
         <w:rPr>
@@ -1201,19 +1137,7 @@
         <w:rPr>
           <w:rFonts w:ascii="Arial" w:hAnsi="Arial" w:cs="Arial"/>
         </w:rPr>
-        <w:t xml:space="preserve"> {</w:t>
-      </w:r>
-      <w:r>
-        <w:rPr>
-          <w:rFonts w:ascii="Arial" w:hAnsi="Arial" w:cs="Arial"/>
-        </w:rPr>
-        <w:t>op</w:t>
-      </w:r>
-      <w:r>
-        <w:rPr>
-          <w:rFonts w:ascii="Arial" w:hAnsi="Arial" w:cs="Arial"/>
-        </w:rPr>
-        <w:t xml:space="preserve"> initials}</w:t>
+        <w:t xml:space="preserve"> {user initials}</w:t>
       </w:r>
     </w:p>
     <w:p>
@@ -1227,8 +1151,34 @@
         <w:rPr>
           <w:rFonts w:ascii="Arial" w:hAnsi="Arial" w:cs="Arial"/>
         </w:rPr>
-        <w:t>Week 1 begins on: {schedule_start_date or “as soon as this schedule is ordered by the Court.”}</w:t>
-      </w:r>
+        <w:t xml:space="preserve">Parent Name: </w:t>
+      </w:r>
+      <w:r>
+        <w:rPr>
+          <w:rFonts w:ascii="Arial" w:hAnsi="Arial" w:cs="Arial"/>
+        </w:rPr>
+        <w:t xml:space="preserve">{other_parties[0]}, </w:t>
+      </w:r>
+      <w:r>
+        <w:rPr>
+          <w:rFonts w:ascii="Arial" w:hAnsi="Arial" w:cs="Arial"/>
+        </w:rPr>
+        <w:t>Initials:</w:t>
+      </w:r>
+      <w:r>
+        <w:rPr>
+          <w:rFonts w:ascii="Arial" w:hAnsi="Arial" w:cs="Arial"/>
+        </w:rPr>
+        <w:t xml:space="preserve"> {op initials}</w:t>
+      </w:r>
+    </w:p>
+    <w:p>
+      <w:pPr>
+        <w:spacing w:after="0"/>
+        <w:rPr>
+          <w:rFonts w:ascii="Arial" w:hAnsi="Arial" w:cs="Arial"/>
+        </w:rPr>
+      </w:pPr>
     </w:p>
     <w:p>
       <w:pPr>
@@ -3037,6 +2987,20 @@
           <w:rFonts w:ascii="Arial" w:hAnsi="Arial" w:cs="Arial"/>
         </w:rPr>
       </w:pPr>
+      <w:r>
+        <w:rPr>
+          <w:rFonts w:ascii="Arial" w:hAnsi="Arial" w:cs="Arial"/>
+        </w:rPr>
+        <w:t>{endif}</w:t>
+      </w:r>
+    </w:p>
+    <w:p>
+      <w:pPr>
+        <w:spacing w:after="0"/>
+        <w:rPr>
+          <w:rFonts w:ascii="Arial" w:hAnsi="Arial" w:cs="Arial"/>
+        </w:rPr>
+      </w:pPr>
     </w:p>
     <w:p>
       <w:pPr>
@@ -3159,7 +3123,19 @@
         <w:rPr>
           <w:rFonts w:ascii="Arial" w:hAnsi="Arial" w:cs="Arial"/>
         </w:rPr>
-        <w:t>{if initials not displayed above}</w:t>
+        <w:t xml:space="preserve">{if </w:t>
+      </w:r>
+      <w:r>
+        <w:rPr>
+          <w:rFonts w:ascii="Arial" w:hAnsi="Arial" w:cs="Arial"/>
+        </w:rPr>
+        <w:t>not weekly_schedule</w:t>
+      </w:r>
+      <w:r>
+        <w:rPr>
+          <w:rFonts w:ascii="Arial" w:hAnsi="Arial" w:cs="Arial"/>
+        </w:rPr>
+        <w:t>}</w:t>
       </w:r>
     </w:p>
     <w:p>
@@ -3225,6 +3201,12 @@
         </w:rPr>
         <w:t xml:space="preserve"> {op initials}</w:t>
       </w:r>
+      <w:r>
+        <w:rPr>
+          <w:rFonts w:ascii="Arial" w:hAnsi="Arial" w:cs="Arial"/>
+        </w:rPr>
+        <w:t>{endif}</w:t>
+      </w:r>
     </w:p>
     <w:p>
       <w:pPr>
@@ -3245,6 +3227,7 @@
         <w:rPr>
           <w:rFonts w:ascii="Arial" w:hAnsi="Arial" w:cs="Arial"/>
         </w:rPr>
+        <w:lastRenderedPageBreak/>
         <w:t>The parents will divide holidays as follows (Use your names or the initials for each parent to show which</w:t>
       </w:r>
       <w:r>
@@ -3554,7 +3537,6 @@
               <w:rPr>
                 <w:rFonts w:ascii="Arial" w:hAnsi="Arial" w:cs="Arial"/>
               </w:rPr>
-              <w:lastRenderedPageBreak/>
               <w:t>EVEN:</w:t>
             </w:r>
           </w:p>
@@ -6139,6 +6121,20 @@
         </w:tc>
       </w:tr>
     </w:tbl>
+    <w:p>
+      <w:pPr>
+        <w:spacing w:after="0"/>
+        <w:rPr>
+          <w:rFonts w:ascii="Arial" w:hAnsi="Arial" w:cs="Arial"/>
+        </w:rPr>
+      </w:pPr>
+      <w:r>
+        <w:rPr>
+          <w:rFonts w:ascii="Arial" w:hAnsi="Arial" w:cs="Arial"/>
+        </w:rPr>
+        <w:t>{endif}</w:t>
+      </w:r>
+    </w:p>
     <w:p>
       <w:pPr>
         <w:spacing w:after="0"/>
@@ -6183,7 +6179,19 @@
         <w:rPr>
           <w:rFonts w:ascii="Arial" w:hAnsi="Arial" w:cs="Arial"/>
         </w:rPr>
-        <w:t>{if initials not displayed above}</w:t>
+        <w:t xml:space="preserve">{if </w:t>
+      </w:r>
+      <w:r>
+        <w:rPr>
+          <w:rFonts w:ascii="Arial" w:hAnsi="Arial" w:cs="Arial"/>
+        </w:rPr>
+        <w:t>not weekly_schedule or holiday_list</w:t>
+      </w:r>
+      <w:r>
+        <w:rPr>
+          <w:rFonts w:ascii="Arial" w:hAnsi="Arial" w:cs="Arial"/>
+        </w:rPr>
+        <w:t>}</w:t>
       </w:r>
     </w:p>
     <w:p>
@@ -6249,6 +6257,12 @@
         </w:rPr>
         <w:t xml:space="preserve"> {op initials}</w:t>
       </w:r>
+      <w:r>
+        <w:rPr>
+          <w:rFonts w:ascii="Arial" w:hAnsi="Arial" w:cs="Arial"/>
+        </w:rPr>
+        <w:t>{endif}</w:t>
+      </w:r>
     </w:p>
     <w:p>
       <w:pPr>
@@ -6269,7 +6283,13 @@
         <w:rPr>
           <w:rFonts w:ascii="Arial" w:hAnsi="Arial" w:cs="Arial"/>
         </w:rPr>
-        <w:t>{if spring_break|</w:t>
+        <w:t>{if spring_break</w:t>
+      </w:r>
+      <w:r>
+        <w:rPr>
+          <w:rFonts w:ascii="Arial" w:hAnsi="Arial" w:cs="Arial"/>
+        </w:rPr>
+        <w:t>}</w:t>
       </w:r>
     </w:p>
     <w:p>
@@ -6311,19 +6331,7 @@
         <w:rPr>
           <w:rFonts w:ascii="Arial" w:hAnsi="Arial" w:cs="Arial"/>
         </w:rPr>
-        <w:t xml:space="preserve">{if even/odd} </w:t>
-      </w:r>
-      <w:r>
-        <w:rPr>
-          <w:rFonts w:ascii="Arial" w:hAnsi="Arial" w:cs="Arial"/>
-        </w:rPr>
-        <w:t>{inits}</w:t>
-      </w:r>
-      <w:r>
-        <w:rPr>
-          <w:rFonts w:ascii="Arial" w:hAnsi="Arial" w:cs="Arial"/>
-        </w:rPr>
-        <w:t xml:space="preserve"> </w:t>
+        <w:t xml:space="preserve">{if even/odd} {inits} </w:t>
       </w:r>
       <w:r>
         <w:rPr>
@@ -6413,6 +6421,12 @@
         </w:rPr>
         <w:t>(Start day/time: {spring break start} End day/time: {spring break end} {end other}</w:t>
       </w:r>
+      <w:r>
+        <w:rPr>
+          <w:rFonts w:ascii="Arial" w:hAnsi="Arial" w:cs="Arial"/>
+        </w:rPr>
+        <w:t>{endif}</w:t>
+      </w:r>
     </w:p>
     <w:p>
       <w:pPr>
@@ -6433,19 +6447,13 @@
         <w:rPr>
           <w:rFonts w:ascii="Arial" w:hAnsi="Arial" w:cs="Arial"/>
         </w:rPr>
-        <w:t xml:space="preserve">{if </w:t>
-      </w:r>
-      <w:r>
-        <w:rPr>
-          <w:rFonts w:ascii="Arial" w:hAnsi="Arial" w:cs="Arial"/>
-        </w:rPr>
-        <w:t>summer</w:t>
-      </w:r>
-      <w:r>
-        <w:rPr>
-          <w:rFonts w:ascii="Arial" w:hAnsi="Arial" w:cs="Arial"/>
-        </w:rPr>
-        <w:t>_break|</w:t>
+        <w:t>{if summer_break</w:t>
+      </w:r>
+      <w:r>
+        <w:rPr>
+          <w:rFonts w:ascii="Arial" w:hAnsi="Arial" w:cs="Arial"/>
+        </w:rPr>
+        <w:t>}</w:t>
       </w:r>
     </w:p>
     <w:p>
@@ -6459,19 +6467,8 @@
         <w:rPr>
           <w:rFonts w:ascii="Arial" w:hAnsi="Arial" w:cs="Arial"/>
         </w:rPr>
-        <w:t xml:space="preserve">School </w:t>
-      </w:r>
-      <w:r>
-        <w:rPr>
-          <w:rFonts w:ascii="Arial" w:hAnsi="Arial" w:cs="Arial"/>
-        </w:rPr>
-        <w:t>Summer</w:t>
-      </w:r>
-      <w:r>
-        <w:rPr>
-          <w:rFonts w:ascii="Arial" w:hAnsi="Arial" w:cs="Arial"/>
-        </w:rPr>
-        <w:t xml:space="preserve"> Break</w:t>
+        <w:lastRenderedPageBreak/>
+        <w:t>School Summer Break</w:t>
       </w:r>
     </w:p>
     <w:p>
@@ -6485,19 +6482,7 @@
         <w:rPr>
           <w:rFonts w:ascii="Arial" w:hAnsi="Arial" w:cs="Arial"/>
         </w:rPr>
-        <w:t xml:space="preserve">{Regular parenting time schedule will be followed during </w:t>
-      </w:r>
-      <w:r>
-        <w:rPr>
-          <w:rFonts w:ascii="Arial" w:hAnsi="Arial" w:cs="Arial"/>
-        </w:rPr>
-        <w:t>summer</w:t>
-      </w:r>
-      <w:r>
-        <w:rPr>
-          <w:rFonts w:ascii="Arial" w:hAnsi="Arial" w:cs="Arial"/>
-        </w:rPr>
-        <w:t xml:space="preserve"> break} or</w:t>
+        <w:t>{Regular parenting time schedule will be followed during summer break} or</w:t>
       </w:r>
     </w:p>
     <w:p>
@@ -6547,13 +6532,7 @@
         <w:rPr>
           <w:rFonts w:ascii="Arial" w:hAnsi="Arial" w:cs="Arial"/>
         </w:rPr>
-        <w:t>summer</w:t>
-      </w:r>
-      <w:r>
-        <w:rPr>
-          <w:rFonts w:ascii="Arial" w:hAnsi="Arial" w:cs="Arial"/>
-        </w:rPr>
-        <w:t xml:space="preserve"> </w:t>
+        <w:t xml:space="preserve">summer </w:t>
       </w:r>
       <w:r>
         <w:rPr>
@@ -6615,20 +6594,7 @@
         <w:rPr>
           <w:rFonts w:ascii="Arial" w:hAnsi="Arial" w:cs="Arial"/>
         </w:rPr>
-        <w:lastRenderedPageBreak/>
-        <w:t xml:space="preserve">{if other}Other: {other </w:t>
-      </w:r>
-      <w:r>
-        <w:rPr>
-          <w:rFonts w:ascii="Arial" w:hAnsi="Arial" w:cs="Arial"/>
-        </w:rPr>
-        <w:t>summer</w:t>
-      </w:r>
-      <w:r>
-        <w:rPr>
-          <w:rFonts w:ascii="Arial" w:hAnsi="Arial" w:cs="Arial"/>
-        </w:rPr>
-        <w:t xml:space="preserve"> break}</w:t>
+        <w:t>{if other}Other: {other summer break}</w:t>
       </w:r>
     </w:p>
     <w:p>
@@ -6642,31 +6608,13 @@
         <w:rPr>
           <w:rFonts w:ascii="Arial" w:hAnsi="Arial" w:cs="Arial"/>
         </w:rPr>
-        <w:t>(Start day/time: {</w:t>
-      </w:r>
-      <w:r>
-        <w:rPr>
-          <w:rFonts w:ascii="Arial" w:hAnsi="Arial" w:cs="Arial"/>
-        </w:rPr>
-        <w:t>summer</w:t>
-      </w:r>
-      <w:r>
-        <w:rPr>
-          <w:rFonts w:ascii="Arial" w:hAnsi="Arial" w:cs="Arial"/>
-        </w:rPr>
-        <w:t xml:space="preserve"> break start} End day/time: {</w:t>
-      </w:r>
-      <w:r>
-        <w:rPr>
-          <w:rFonts w:ascii="Arial" w:hAnsi="Arial" w:cs="Arial"/>
-        </w:rPr>
-        <w:t>summer</w:t>
-      </w:r>
-      <w:r>
-        <w:rPr>
-          <w:rFonts w:ascii="Arial" w:hAnsi="Arial" w:cs="Arial"/>
-        </w:rPr>
-        <w:t xml:space="preserve"> break end} {end other}</w:t>
+        <w:t>(Start day/time: {summer break start} End day/time: {summer break end} {end other}</w:t>
+      </w:r>
+      <w:r>
+        <w:rPr>
+          <w:rFonts w:ascii="Arial" w:hAnsi="Arial" w:cs="Arial"/>
+        </w:rPr>
+        <w:t>{endif}</w:t>
       </w:r>
     </w:p>
     <w:p>
@@ -6688,19 +6636,13 @@
         <w:rPr>
           <w:rFonts w:ascii="Arial" w:hAnsi="Arial" w:cs="Arial"/>
         </w:rPr>
-        <w:t xml:space="preserve">{if </w:t>
-      </w:r>
-      <w:r>
-        <w:rPr>
-          <w:rFonts w:ascii="Arial" w:hAnsi="Arial" w:cs="Arial"/>
-        </w:rPr>
-        <w:t>winter</w:t>
-      </w:r>
-      <w:r>
-        <w:rPr>
-          <w:rFonts w:ascii="Arial" w:hAnsi="Arial" w:cs="Arial"/>
-        </w:rPr>
-        <w:t>_break|</w:t>
+        <w:t>{if winter_break</w:t>
+      </w:r>
+      <w:r>
+        <w:rPr>
+          <w:rFonts w:ascii="Arial" w:hAnsi="Arial" w:cs="Arial"/>
+        </w:rPr>
+        <w:t>}</w:t>
       </w:r>
     </w:p>
     <w:p>
@@ -6714,19 +6656,7 @@
         <w:rPr>
           <w:rFonts w:ascii="Arial" w:hAnsi="Arial" w:cs="Arial"/>
         </w:rPr>
-        <w:t xml:space="preserve">School </w:t>
-      </w:r>
-      <w:r>
-        <w:rPr>
-          <w:rFonts w:ascii="Arial" w:hAnsi="Arial" w:cs="Arial"/>
-        </w:rPr>
-        <w:t>Winter</w:t>
-      </w:r>
-      <w:r>
-        <w:rPr>
-          <w:rFonts w:ascii="Arial" w:hAnsi="Arial" w:cs="Arial"/>
-        </w:rPr>
-        <w:t xml:space="preserve"> Break</w:t>
+        <w:t>School Winter Break</w:t>
       </w:r>
     </w:p>
     <w:p>
@@ -6740,19 +6670,7 @@
         <w:rPr>
           <w:rFonts w:ascii="Arial" w:hAnsi="Arial" w:cs="Arial"/>
         </w:rPr>
-        <w:t xml:space="preserve">{Regular parenting time schedule will be followed during </w:t>
-      </w:r>
-      <w:r>
-        <w:rPr>
-          <w:rFonts w:ascii="Arial" w:hAnsi="Arial" w:cs="Arial"/>
-        </w:rPr>
-        <w:t>winter</w:t>
-      </w:r>
-      <w:r>
-        <w:rPr>
-          <w:rFonts w:ascii="Arial" w:hAnsi="Arial" w:cs="Arial"/>
-        </w:rPr>
-        <w:t xml:space="preserve"> break} or</w:t>
+        <w:t>{Regular parenting time schedule will be followed during winter break} or</w:t>
       </w:r>
     </w:p>
     <w:p>
@@ -6802,13 +6720,7 @@
         <w:rPr>
           <w:rFonts w:ascii="Arial" w:hAnsi="Arial" w:cs="Arial"/>
         </w:rPr>
-        <w:t>winter</w:t>
-      </w:r>
-      <w:r>
-        <w:rPr>
-          <w:rFonts w:ascii="Arial" w:hAnsi="Arial" w:cs="Arial"/>
-        </w:rPr>
-        <w:t xml:space="preserve"> </w:t>
+        <w:t xml:space="preserve">winter </w:t>
       </w:r>
       <w:r>
         <w:rPr>
@@ -6870,19 +6782,7 @@
         <w:rPr>
           <w:rFonts w:ascii="Arial" w:hAnsi="Arial" w:cs="Arial"/>
         </w:rPr>
-        <w:t xml:space="preserve">{if other}Other: {other </w:t>
-      </w:r>
-      <w:r>
-        <w:rPr>
-          <w:rFonts w:ascii="Arial" w:hAnsi="Arial" w:cs="Arial"/>
-        </w:rPr>
-        <w:t>winter</w:t>
-      </w:r>
-      <w:r>
-        <w:rPr>
-          <w:rFonts w:ascii="Arial" w:hAnsi="Arial" w:cs="Arial"/>
-        </w:rPr>
-        <w:t xml:space="preserve"> break}</w:t>
+        <w:t>{if other}Other: {other winter break}</w:t>
       </w:r>
     </w:p>
     <w:p>
@@ -6896,31 +6796,27 @@
         <w:rPr>
           <w:rFonts w:ascii="Arial" w:hAnsi="Arial" w:cs="Arial"/>
         </w:rPr>
-        <w:t>(Start day/time: {</w:t>
-      </w:r>
-      <w:r>
-        <w:rPr>
-          <w:rFonts w:ascii="Arial" w:hAnsi="Arial" w:cs="Arial"/>
-        </w:rPr>
-        <w:t>winter</w:t>
-      </w:r>
-      <w:r>
-        <w:rPr>
-          <w:rFonts w:ascii="Arial" w:hAnsi="Arial" w:cs="Arial"/>
-        </w:rPr>
-        <w:t xml:space="preserve"> break start} End day/time: {</w:t>
-      </w:r>
-      <w:r>
-        <w:rPr>
-          <w:rFonts w:ascii="Arial" w:hAnsi="Arial" w:cs="Arial"/>
-        </w:rPr>
-        <w:t>winter</w:t>
-      </w:r>
-      <w:r>
-        <w:rPr>
-          <w:rFonts w:ascii="Arial" w:hAnsi="Arial" w:cs="Arial"/>
-        </w:rPr>
-        <w:t xml:space="preserve"> break end} {end other}</w:t>
+        <w:t>(Start day/time: {winter break start} End day/time: {winter break end} {end other}</w:t>
+      </w:r>
+      <w:r>
+        <w:rPr>
+          <w:rFonts w:ascii="Arial" w:hAnsi="Arial" w:cs="Arial"/>
+        </w:rPr>
+        <w:t>{endif}</w:t>
+      </w:r>
+    </w:p>
+    <w:p>
+      <w:pPr>
+        <w:spacing w:after="0"/>
+        <w:rPr>
+          <w:rFonts w:ascii="Arial" w:hAnsi="Arial" w:cs="Arial"/>
+        </w:rPr>
+      </w:pPr>
+      <w:r>
+        <w:rPr>
+          <w:rFonts w:ascii="Arial" w:hAnsi="Arial" w:cs="Arial"/>
+        </w:rPr>
+        <w:t>{endif}</w:t>
       </w:r>
     </w:p>
     <w:p>
@@ -7061,6 +6957,12 @@
         </w:rPr>
         <w:t>Other: {other_transportation}</w:t>
       </w:r>
+      <w:r>
+        <w:rPr>
+          <w:rFonts w:ascii="Arial" w:hAnsi="Arial" w:cs="Arial"/>
+        </w:rPr>
+        <w:t>{endif}</w:t>
+      </w:r>
     </w:p>
     <w:p>
       <w:pPr>
@@ -7092,19 +6994,7 @@
         <w:rPr>
           <w:rFonts w:ascii="Arial" w:hAnsi="Arial" w:cs="Arial"/>
         </w:rPr>
-        <w:t xml:space="preserve"> EXCHANGE OF CHILDREN (</w:t>
-      </w:r>
-      <w:r>
-        <w:rPr>
-          <w:rFonts w:ascii="Arial" w:hAnsi="Arial" w:cs="Arial"/>
-        </w:rPr>
-        <w:t>show only 1</w:t>
-      </w:r>
-      <w:r>
-        <w:rPr>
-          <w:rFonts w:ascii="Arial" w:hAnsi="Arial" w:cs="Arial"/>
-        </w:rPr>
-        <w:t>)</w:t>
+        <w:t xml:space="preserve"> EXCHANGE OF CHILDREN</w:t>
       </w:r>
     </w:p>
     <w:p>
@@ -7118,6 +7008,12 @@
         <w:rPr>
           <w:rFonts w:ascii="Arial" w:hAnsi="Arial" w:cs="Arial"/>
         </w:rPr>
+        <w:t>{if exchange_location == “homes”}</w:t>
+      </w:r>
+      <w:r>
+        <w:rPr>
+          <w:rFonts w:ascii="Arial" w:hAnsi="Arial" w:cs="Arial"/>
+        </w:rPr>
         <w:t xml:space="preserve">Drop off and pick up of the </w:t>
       </w:r>
       <w:r>
@@ -7149,6 +7045,18 @@
           <w:rFonts w:ascii="Arial" w:hAnsi="Arial" w:cs="Arial"/>
         </w:rPr>
         <w:t>agree in advance to a different meeting place.</w:t>
+      </w:r>
+      <w:r>
+        <w:rPr>
+          <w:rFonts w:ascii="Arial" w:hAnsi="Arial" w:cs="Arial"/>
+        </w:rPr>
+        <w:t xml:space="preserve"> </w:t>
+      </w:r>
+      <w:r>
+        <w:rPr>
+          <w:rFonts w:ascii="Arial" w:hAnsi="Arial" w:cs="Arial"/>
+        </w:rPr>
+        <w:t>{endif}</w:t>
       </w:r>
     </w:p>
     <w:p>
@@ -7162,6 +7070,24 @@
         <w:rPr>
           <w:rFonts w:ascii="Arial" w:hAnsi="Arial" w:cs="Arial"/>
         </w:rPr>
+        <w:t>{if exchange_location == “</w:t>
+      </w:r>
+      <w:r>
+        <w:rPr>
+          <w:rFonts w:ascii="Arial" w:hAnsi="Arial" w:cs="Arial"/>
+        </w:rPr>
+        <w:t>location</w:t>
+      </w:r>
+      <w:r>
+        <w:rPr>
+          <w:rFonts w:ascii="Arial" w:hAnsi="Arial" w:cs="Arial"/>
+        </w:rPr>
+        <w:t>”}</w:t>
+      </w:r>
+      <w:r>
+        <w:rPr>
+          <w:rFonts w:ascii="Arial" w:hAnsi="Arial" w:cs="Arial"/>
+        </w:rPr>
         <w:t>Drop off and pick up will take place at</w:t>
       </w:r>
       <w:r>
@@ -7169,6 +7095,18 @@
           <w:rFonts w:ascii="Arial" w:hAnsi="Arial" w:cs="Arial"/>
         </w:rPr>
         <w:t xml:space="preserve"> {location name, location address and city}.</w:t>
+      </w:r>
+      <w:r>
+        <w:rPr>
+          <w:rFonts w:ascii="Arial" w:hAnsi="Arial" w:cs="Arial"/>
+        </w:rPr>
+        <w:t>{endif}</w:t>
+      </w:r>
+      <w:r>
+        <w:rPr>
+          <w:rFonts w:ascii="Arial" w:hAnsi="Arial" w:cs="Arial"/>
+        </w:rPr>
+        <w:t>{endif}</w:t>
       </w:r>
     </w:p>
     <w:p>
@@ -7195,13 +7133,13 @@
         <w:rPr>
           <w:rFonts w:ascii="Arial" w:hAnsi="Arial" w:cs="Arial"/>
         </w:rPr>
-        <w:t>{if first_refusal}</w:t>
-      </w:r>
-      <w:r>
-        <w:rPr>
-          <w:rFonts w:ascii="Arial" w:hAnsi="Arial" w:cs="Arial"/>
-        </w:rPr>
-        <w:t xml:space="preserve"> FIRST REFUSAL FOR CHILDCARE</w:t>
+        <w:t>{if additional_time}</w:t>
+      </w:r>
+      <w:r>
+        <w:rPr>
+          <w:rFonts w:ascii="Arial" w:hAnsi="Arial" w:cs="Arial"/>
+        </w:rPr>
+        <w:t>ADDITIONAL INFORMATION</w:t>
       </w:r>
     </w:p>
     <w:p>
@@ -7215,434 +7153,13 @@
         <w:rPr>
           <w:rFonts w:ascii="Arial" w:hAnsi="Arial" w:cs="Arial"/>
         </w:rPr>
-        <w:t>Each</w:t>
-      </w:r>
-      <w:r>
-        <w:rPr>
-          <w:rFonts w:ascii="Arial" w:hAnsi="Arial" w:cs="Arial"/>
-        </w:rPr>
-        <w:t xml:space="preserve"> parent must offer the other a first right of refusal as follows.</w:t>
-      </w:r>
-    </w:p>
-    <w:p>
-      <w:pPr>
-        <w:pStyle w:val="ListParagraph"/>
-        <w:numPr>
-          <w:ilvl w:val="0"/>
-          <w:numId w:val="4"/>
-        </w:numPr>
-        <w:spacing w:after="0"/>
-        <w:rPr>
-          <w:rFonts w:ascii="Arial" w:hAnsi="Arial" w:cs="Arial"/>
-        </w:rPr>
-      </w:pPr>
-      <w:r>
-        <w:rPr>
-          <w:rFonts w:ascii="Arial" w:hAnsi="Arial" w:cs="Arial"/>
-        </w:rPr>
-        <w:t xml:space="preserve">If a parent needs childcare for a period of 24 hours or more during their time with the </w:t>
-      </w:r>
-      <w:r>
-        <w:rPr>
-          <w:rFonts w:ascii="Arial" w:hAnsi="Arial" w:cs="Arial"/>
-        </w:rPr>
-        <w:t>{child or children}</w:t>
-      </w:r>
-      <w:r>
-        <w:rPr>
-          <w:rFonts w:ascii="Arial" w:hAnsi="Arial" w:cs="Arial"/>
-        </w:rPr>
-        <w:t>,</w:t>
-      </w:r>
-      <w:r>
-        <w:rPr>
-          <w:rFonts w:ascii="Arial" w:hAnsi="Arial" w:cs="Arial"/>
-        </w:rPr>
-        <w:t xml:space="preserve"> </w:t>
-      </w:r>
-      <w:r>
-        <w:rPr>
-          <w:rFonts w:ascii="Arial" w:hAnsi="Arial" w:cs="Arial"/>
-        </w:rPr>
-        <w:t xml:space="preserve">they must give the other parent the option to care for the </w:t>
-      </w:r>
-      <w:r>
-        <w:rPr>
-          <w:rFonts w:ascii="Arial" w:hAnsi="Arial" w:cs="Arial"/>
-        </w:rPr>
-        <w:t>{child or children}</w:t>
-      </w:r>
-      <w:r>
-        <w:rPr>
-          <w:rFonts w:ascii="Arial" w:hAnsi="Arial" w:cs="Arial"/>
-        </w:rPr>
-        <w:t xml:space="preserve"> </w:t>
-      </w:r>
-      <w:r>
-        <w:rPr>
-          <w:rFonts w:ascii="Arial" w:hAnsi="Arial" w:cs="Arial"/>
-        </w:rPr>
-        <w:t>before finding other</w:t>
-      </w:r>
-      <w:r>
-        <w:rPr>
-          <w:rFonts w:ascii="Arial" w:hAnsi="Arial" w:cs="Arial"/>
-        </w:rPr>
-        <w:t xml:space="preserve"> </w:t>
-      </w:r>
-      <w:r>
-        <w:rPr>
-          <w:rFonts w:ascii="Arial" w:hAnsi="Arial" w:cs="Arial"/>
-        </w:rPr>
-        <w:t>childcare.</w:t>
-      </w:r>
-    </w:p>
-    <w:p>
-      <w:pPr>
-        <w:pStyle w:val="ListParagraph"/>
-        <w:numPr>
-          <w:ilvl w:val="0"/>
-          <w:numId w:val="4"/>
-        </w:numPr>
-        <w:spacing w:after="0"/>
-        <w:rPr>
-          <w:rFonts w:ascii="Arial" w:hAnsi="Arial" w:cs="Arial"/>
-        </w:rPr>
-      </w:pPr>
-      <w:r>
-        <w:rPr>
-          <w:rFonts w:ascii="Arial" w:hAnsi="Arial" w:cs="Arial"/>
-        </w:rPr>
-        <w:t>As soon as the need for childcare is known, the parent in need of childcare will contact the other</w:t>
-      </w:r>
-      <w:r>
-        <w:rPr>
-          <w:rFonts w:ascii="Arial" w:hAnsi="Arial" w:cs="Arial"/>
-        </w:rPr>
-        <w:t xml:space="preserve"> </w:t>
-      </w:r>
-      <w:r>
-        <w:rPr>
-          <w:rFonts w:ascii="Arial" w:hAnsi="Arial" w:cs="Arial"/>
-        </w:rPr>
-        <w:t>parent.</w:t>
-      </w:r>
-    </w:p>
-    <w:p>
-      <w:pPr>
-        <w:pStyle w:val="ListParagraph"/>
-        <w:numPr>
-          <w:ilvl w:val="0"/>
-          <w:numId w:val="4"/>
-        </w:numPr>
-        <w:spacing w:after="0"/>
-        <w:rPr>
-          <w:rFonts w:ascii="Arial" w:hAnsi="Arial" w:cs="Arial"/>
-        </w:rPr>
-      </w:pPr>
-      <w:r>
-        <w:rPr>
-          <w:rFonts w:ascii="Arial" w:hAnsi="Arial" w:cs="Arial"/>
-        </w:rPr>
-        <w:t xml:space="preserve">The parent offered the right to care for the </w:t>
-      </w:r>
-      <w:r>
-        <w:rPr>
-          <w:rFonts w:ascii="Arial" w:hAnsi="Arial" w:cs="Arial"/>
-        </w:rPr>
-        <w:t>{child or children}</w:t>
-      </w:r>
-      <w:r>
-        <w:rPr>
-          <w:rFonts w:ascii="Arial" w:hAnsi="Arial" w:cs="Arial"/>
-        </w:rPr>
-        <w:t xml:space="preserve"> </w:t>
-      </w:r>
-      <w:r>
-        <w:rPr>
-          <w:rFonts w:ascii="Arial" w:hAnsi="Arial" w:cs="Arial"/>
-        </w:rPr>
-        <w:t>must accept the offer within 2</w:t>
-      </w:r>
-    </w:p>
-    <w:p>
-      <w:pPr>
-        <w:pStyle w:val="ListParagraph"/>
-        <w:numPr>
-          <w:ilvl w:val="0"/>
-          <w:numId w:val="4"/>
-        </w:numPr>
-        <w:spacing w:after="0"/>
-        <w:rPr>
-          <w:rFonts w:ascii="Arial" w:hAnsi="Arial" w:cs="Arial"/>
-        </w:rPr>
-      </w:pPr>
-      <w:r>
-        <w:rPr>
-          <w:rFonts w:ascii="Arial" w:hAnsi="Arial" w:cs="Arial"/>
-        </w:rPr>
-        <w:t>hours. If they do not, the parent needing childcare may use another caregiver.</w:t>
-      </w:r>
-    </w:p>
-    <w:p>
-      <w:pPr>
-        <w:pStyle w:val="ListParagraph"/>
-        <w:numPr>
-          <w:ilvl w:val="0"/>
-          <w:numId w:val="4"/>
-        </w:numPr>
-        <w:spacing w:after="0"/>
-        <w:rPr>
-          <w:rFonts w:ascii="Arial" w:hAnsi="Arial" w:cs="Arial"/>
-        </w:rPr>
-      </w:pPr>
-      <w:r>
-        <w:rPr>
-          <w:rFonts w:ascii="Arial" w:hAnsi="Arial" w:cs="Arial"/>
-        </w:rPr>
-        <w:t xml:space="preserve">Transportation of the </w:t>
-      </w:r>
-      <w:r>
-        <w:rPr>
-          <w:rFonts w:ascii="Arial" w:hAnsi="Arial" w:cs="Arial"/>
-        </w:rPr>
-        <w:t>{child or children}</w:t>
-      </w:r>
-      <w:r>
-        <w:rPr>
-          <w:rFonts w:ascii="Arial" w:hAnsi="Arial" w:cs="Arial"/>
-        </w:rPr>
-        <w:t xml:space="preserve"> </w:t>
-      </w:r>
-      <w:r>
-        <w:rPr>
-          <w:rFonts w:ascii="Arial" w:hAnsi="Arial" w:cs="Arial"/>
-        </w:rPr>
-        <w:t>is the same as for other parenting time.</w:t>
-      </w:r>
-    </w:p>
-    <w:p>
-      <w:pPr>
-        <w:spacing w:after="0"/>
-        <w:rPr>
-          <w:rFonts w:ascii="Arial" w:hAnsi="Arial" w:cs="Arial"/>
-        </w:rPr>
-      </w:pPr>
-    </w:p>
-    <w:p>
-      <w:pPr>
-        <w:pStyle w:val="ListParagraph"/>
-        <w:numPr>
-          <w:ilvl w:val="0"/>
-          <w:numId w:val="3"/>
-        </w:numPr>
-        <w:spacing w:after="0"/>
-        <w:rPr>
-          <w:rFonts w:ascii="Arial" w:hAnsi="Arial" w:cs="Arial"/>
-        </w:rPr>
-      </w:pPr>
-      <w:r>
-        <w:rPr>
-          <w:rFonts w:ascii="Arial" w:hAnsi="Arial" w:cs="Arial"/>
-        </w:rPr>
-        <w:t>{if communication}</w:t>
-      </w:r>
-      <w:r>
-        <w:rPr>
-          <w:rFonts w:ascii="Arial" w:hAnsi="Arial" w:cs="Arial"/>
-        </w:rPr>
-        <w:t xml:space="preserve"> COMMUNICATION (show only 1)</w:t>
-      </w:r>
-    </w:p>
-    <w:p>
-      <w:pPr>
-        <w:spacing w:after="0"/>
-        <w:rPr>
-          <w:rFonts w:ascii="Arial" w:hAnsi="Arial" w:cs="Arial"/>
-        </w:rPr>
-      </w:pPr>
-      <w:r>
-        <w:rPr>
-          <w:rFonts w:ascii="Arial" w:hAnsi="Arial" w:cs="Arial"/>
-        </w:rPr>
-        <w:t xml:space="preserve">Electronic communication between the </w:t>
-      </w:r>
-      <w:r>
-        <w:rPr>
-          <w:rFonts w:ascii="Arial" w:hAnsi="Arial" w:cs="Arial"/>
-        </w:rPr>
-        <w:t>{child or children}</w:t>
-      </w:r>
-      <w:r>
-        <w:rPr>
-          <w:rFonts w:ascii="Arial" w:hAnsi="Arial" w:cs="Arial"/>
-        </w:rPr>
-        <w:t xml:space="preserve"> </w:t>
-      </w:r>
-      <w:r>
-        <w:rPr>
-          <w:rFonts w:ascii="Arial" w:hAnsi="Arial" w:cs="Arial"/>
-        </w:rPr>
-        <w:t>and the other parent must not be unreasonably</w:t>
-      </w:r>
-      <w:r>
-        <w:rPr>
-          <w:rFonts w:ascii="Arial" w:hAnsi="Arial" w:cs="Arial"/>
-        </w:rPr>
-        <w:t xml:space="preserve"> </w:t>
-      </w:r>
-      <w:r>
-        <w:rPr>
-          <w:rFonts w:ascii="Arial" w:hAnsi="Arial" w:cs="Arial"/>
-        </w:rPr>
-        <w:t>monitored or interrupted. Electronic communication includes telephone, e-mail, text, video, etc.</w:t>
-      </w:r>
-    </w:p>
-    <w:p>
-      <w:pPr>
-        <w:spacing w:after="0"/>
-        <w:rPr>
-          <w:rFonts w:ascii="Arial" w:hAnsi="Arial" w:cs="Arial"/>
-        </w:rPr>
-      </w:pPr>
-    </w:p>
-    <w:p>
-      <w:pPr>
-        <w:spacing w:after="0"/>
-        <w:rPr>
-          <w:rFonts w:ascii="Arial" w:hAnsi="Arial" w:cs="Arial"/>
-        </w:rPr>
-      </w:pPr>
-      <w:r>
-        <w:rPr>
-          <w:rFonts w:ascii="Arial" w:hAnsi="Arial" w:cs="Arial"/>
-        </w:rPr>
-        <w:t>T</w:t>
-      </w:r>
-      <w:r>
-        <w:rPr>
-          <w:rFonts w:ascii="Arial" w:hAnsi="Arial" w:cs="Arial"/>
-        </w:rPr>
-        <w:t xml:space="preserve">he </w:t>
-      </w:r>
-      <w:r>
-        <w:rPr>
-          <w:rFonts w:ascii="Arial" w:hAnsi="Arial" w:cs="Arial"/>
-        </w:rPr>
-        <w:t>{child or children}</w:t>
-      </w:r>
-      <w:r>
-        <w:rPr>
-          <w:rFonts w:ascii="Arial" w:hAnsi="Arial" w:cs="Arial"/>
-        </w:rPr>
-        <w:t xml:space="preserve"> </w:t>
-      </w:r>
-      <w:r>
-        <w:rPr>
-          <w:rFonts w:ascii="Arial" w:hAnsi="Arial" w:cs="Arial"/>
-        </w:rPr>
-        <w:t xml:space="preserve">can </w:t>
-      </w:r>
-      <w:r>
-        <w:rPr>
-          <w:rFonts w:ascii="Arial" w:hAnsi="Arial" w:cs="Arial"/>
-        </w:rPr>
-        <w:t>communicate with the parent they are not with</w:t>
-      </w:r>
-      <w:r>
-        <w:rPr>
-          <w:rFonts w:ascii="Arial" w:hAnsi="Arial" w:cs="Arial"/>
-        </w:rPr>
-        <w:t>:</w:t>
-      </w:r>
-    </w:p>
-    <w:p>
-      <w:pPr>
-        <w:spacing w:after="0"/>
-        <w:rPr>
-          <w:rFonts w:ascii="Arial" w:hAnsi="Arial" w:cs="Arial"/>
-        </w:rPr>
-      </w:pPr>
-      <w:r>
-        <w:rPr>
-          <w:rFonts w:ascii="Arial" w:hAnsi="Arial" w:cs="Arial"/>
-        </w:rPr>
-        <w:t>Anytime</w:t>
-      </w:r>
-    </w:p>
-    <w:p>
-      <w:pPr>
-        <w:spacing w:after="0"/>
-        <w:rPr>
-          <w:rFonts w:ascii="Arial" w:hAnsi="Arial" w:cs="Arial"/>
-        </w:rPr>
-      </w:pPr>
-      <w:r>
-        <w:rPr>
-          <w:rFonts w:ascii="Arial" w:hAnsi="Arial" w:cs="Arial"/>
-        </w:rPr>
-        <w:t>Everyday between {communication start} and {communication end}</w:t>
-      </w:r>
-    </w:p>
-    <w:p>
-      <w:pPr>
-        <w:spacing w:after="0"/>
-        <w:rPr>
-          <w:rFonts w:ascii="Arial" w:hAnsi="Arial" w:cs="Arial"/>
-        </w:rPr>
-      </w:pPr>
-      <w:r>
-        <w:rPr>
-          <w:rFonts w:ascii="Arial" w:hAnsi="Arial" w:cs="Arial"/>
-        </w:rPr>
-        <w:t>Other: {other communication }</w:t>
-      </w:r>
-    </w:p>
-    <w:p>
-      <w:pPr>
-        <w:spacing w:after="0"/>
-        <w:rPr>
-          <w:rFonts w:ascii="Arial" w:hAnsi="Arial" w:cs="Arial"/>
-        </w:rPr>
-      </w:pPr>
-    </w:p>
-    <w:p>
-      <w:pPr>
-        <w:pStyle w:val="ListParagraph"/>
-        <w:numPr>
-          <w:ilvl w:val="0"/>
-          <w:numId w:val="3"/>
-        </w:numPr>
-        <w:spacing w:after="0"/>
-        <w:rPr>
-          <w:rFonts w:ascii="Arial" w:hAnsi="Arial" w:cs="Arial"/>
-        </w:rPr>
-      </w:pPr>
-      <w:r>
-        <w:rPr>
-          <w:rFonts w:ascii="Arial" w:hAnsi="Arial" w:cs="Arial"/>
-        </w:rPr>
-        <w:t>{if additional_time}</w:t>
-      </w:r>
-      <w:r>
-        <w:rPr>
-          <w:rFonts w:ascii="Arial" w:hAnsi="Arial" w:cs="Arial"/>
-        </w:rPr>
-        <w:t>ADDITIONAL INFORMATION</w:t>
-      </w:r>
-    </w:p>
-    <w:p>
-      <w:pPr>
-        <w:spacing w:after="0"/>
-        <w:rPr>
-          <w:rFonts w:ascii="Arial" w:hAnsi="Arial" w:cs="Arial"/>
-        </w:rPr>
-      </w:pPr>
-      <w:r>
-        <w:rPr>
-          <w:rFonts w:ascii="Arial" w:hAnsi="Arial" w:cs="Arial"/>
-        </w:rPr>
         <w:t>{additional_time_details}</w:t>
+      </w:r>
+      <w:r>
+        <w:rPr>
+          <w:rFonts w:ascii="Arial" w:hAnsi="Arial" w:cs="Arial"/>
+        </w:rPr>
+        <w:t>{endif}</w:t>
       </w:r>
     </w:p>
     <w:p>
@@ -8847,8 +8364,8 @@
         <w:tblLook w:val="04A0" w:firstRow="1" w:lastRow="0" w:firstColumn="1" w:lastColumn="0" w:noHBand="0" w:noVBand="1"/>
       </w:tblPr>
       <w:tblGrid>
-        <w:gridCol w:w="524"/>
-        <w:gridCol w:w="8826"/>
+        <w:gridCol w:w="1190"/>
+        <w:gridCol w:w="8170"/>
       </w:tblGrid>
       <w:tr>
         <w:tc>

</xml_diff>